<commit_message>
feat: keep contact lines separate in the resume model
Contact info (email, LinkedIn, phone) collapsed to a single line during
import and export: the DOCX parser replaced soft breaks (<br>) with a
space, and the model stored contact as one string.

Change contact to an ordered array of non-empty lines:
- DOCX parser splits soft breaks into separate blocks
- AI schema and prompt emit one array element per line
- DOCX and PDF export render one line per contact item
- Review screen shows each line on its own row
- Regenerate binary fixtures with real soft breaks
</commit_message>
<xml_diff>
--- a/fixtures/files/curriculo-completo.docx
+++ b/fixtures/files/curriculo-completo.docx
@@ -20,7 +20,15 @@
     </w:p>
     <w:p>
       <w:r>
-        <w:t xml:space="preserve">marina.alencar@email.com · (11) 98888-1234 · São Paulo, SP</w:t>
+        <w:t xml:space="preserve">marina.alencar@email.com</w:t>
+      </w:r>
+      <w:r>
+        <w:br/>
+        <w:t xml:space="preserve">(11) 98888-1234</w:t>
+      </w:r>
+      <w:r>
+        <w:br/>
+        <w:t xml:space="preserve">São Paulo, SP</w:t>
       </w:r>
     </w:p>
     <w:p>

</xml_diff>